<commit_message>
Fixed document version number from 0.1 -> 0.2
</commit_message>
<xml_diff>
--- a/docs/p1/P1_Team02_Final.docx
+++ b/docs/p1/P1_Team02_Final.docx
@@ -335,7 +335,15 @@
                 <w:sz w:val="18"/>
                 <w:szCs w:val="18"/>
               </w:rPr>
-              <w:t>0.1</w:t>
+              <w:t>0.</w:t>
+            </w:r>
+            <w:r>
+              <w:rPr>
+                <w:color w:val="1A1A1A"/>
+                <w:sz w:val="18"/>
+                <w:szCs w:val="18"/>
+              </w:rPr>
+              <w:t>2</w:t>
             </w:r>
           </w:p>
         </w:tc>
@@ -12906,7 +12914,7 @@
         <w:rFonts w:ascii="Calibri" w:eastAsia="Calibri" w:hAnsi="Calibri" w:cs="Calibri"/>
         <w:sz w:val="21"/>
         <w:szCs w:val="21"/>
-        <w:lang w:eastAsia="en-US" w:bidi="ar-SA"/>
+        <w:lang w:val="en-US" w:eastAsia="en-US" w:bidi="ar-SA"/>
       </w:rPr>
     </w:rPrDefault>
     <w:pPrDefault/>

</xml_diff>